<commit_message>
ELDA direction: addressed to SI ELDA Wing; subtitle and status removed
The shared title block now accepts documents without a subtitle line.

Co-Authored-By: Claude Fable 5.1 <noreply@anthropic.com>
Claude-Session: https://claude.ai/code/session_01LgFPs3fMSncBgbYQ3PfA3o
</commit_message>
<xml_diff>
--- a/output/elda-physical-preparedness-direction.docx
+++ b/output/elda-physical-preparedness-direction.docx
@@ -56,7 +56,7 @@
           <w:sz w:val="20"/>
           <w:spacing w:val="40"/>
         </w:rPr>
-        <w:t>DIRECTION TO ELDA WING</w:t>
+        <w:t>DIRECTION TO SI ELDA WING</w:t>
       </w:r>
     </w:p>
     <w:p>
@@ -83,17 +83,6 @@
           <w:bottom w:val="single" w:sz="18" w:space="8" w:color="C62026"/>
         </w:pBdr>
       </w:pPr>
-      <w:r>
-        <w:rPr>
-          <w:rFonts w:ascii="Arial" w:hAnsi="Arial" w:cs="Arial"/>
-          <w:b/>
-          <w:i w:val="0"/>
-          <w:color w:val="002516"/>
-          <w:sz w:val="19"/>
-          <w:spacing w:val="30"/>
-        </w:rPr>
-        <w:t>COMDT ACS DIRECTION OF 10 SEPTEMBER 2026 APPLIED TO ELDA DELIVERY</w:t>
-      </w:r>
     </w:p>
     <w:p>
       <w:pPr>
@@ -165,36 +154,6 @@
           <w:sz w:val="18"/>
         </w:rPr>
         <w:t>September 2026</w:t>
-      </w:r>
-      <w:r>
-        <w:rPr>
-          <w:rFonts w:ascii="Arial" w:hAnsi="Arial" w:cs="Arial"/>
-          <w:b w:val="0"/>
-          <w:i w:val="0"/>
-          <w:color w:val="A89662"/>
-          <w:sz w:val="18"/>
-        </w:rPr>
-        <w:t xml:space="preserve">   ·   </w:t>
-      </w:r>
-      <w:r>
-        <w:rPr>
-          <w:rFonts w:ascii="Arial" w:hAnsi="Arial" w:cs="Arial"/>
-          <w:b/>
-          <w:i w:val="0"/>
-          <w:color w:val="002516"/>
-          <w:sz w:val="18"/>
-        </w:rPr>
-        <w:t xml:space="preserve">Status: </w:t>
-      </w:r>
-      <w:r>
-        <w:rPr>
-          <w:rFonts w:ascii="Arial" w:hAnsi="Arial" w:cs="Arial"/>
-          <w:b/>
-          <w:i w:val="0"/>
-          <w:color w:val="C62026"/>
-          <w:sz w:val="18"/>
-        </w:rPr>
-        <w:t>For action</w:t>
       </w:r>
     </w:p>
     <w:p>
@@ -493,7 +452,7 @@
         <w:color w:val="000000"/>
         <w:sz w:val="17"/>
       </w:rPr>
-      <w:t>NZALC | Direction to ELDA Wing</w:t>
+      <w:t>NZALC | Direction to SI ELDA Wing</w:t>
     </w:r>
     <w:r>
       <w:rPr>

</xml_diff>